<commit_message>
Reference Report generation scripts ready
</commit_message>
<xml_diff>
--- a/reports/common/reference.docx
+++ b/reports/common/reference.docx
@@ -205,16 +205,18 @@
     <w:tbl>
       <w:tblPr>
         <w:tblStyle w:val="Table"/>
-        <w:tblW w:w="0" w:type="pct"/>
+        <w:tblW w:w="5000" w:type="pct"/>
+        <w:jc w:val="center"/>
         <w:tblLook w:val="07E0" w:firstRow="1" w:lastRow="1" w:firstColumn="1" w:lastColumn="1" w:noHBand="1" w:noVBand="1"/>
       </w:tblPr>
       <w:tblGrid>
-        <w:gridCol w:w="803"/>
-        <w:gridCol w:w="803"/>
+        <w:gridCol w:w="4811"/>
+        <w:gridCol w:w="4811"/>
       </w:tblGrid>
       <w:tr>
         <w:trPr>
           <w:cnfStyle w:val="100000000000" w:firstRow="1" w:lastRow="0" w:firstColumn="0" w:lastColumn="0" w:oddVBand="0" w:evenVBand="0" w:oddHBand="0" w:evenHBand="0" w:firstRowFirstColumn="0" w:firstRowLastColumn="0" w:lastRowFirstColumn="0" w:lastRowLastColumn="0"/>
+          <w:jc w:val="center"/>
         </w:trPr>
         <w:tc>
           <w:tcPr>
@@ -244,6 +246,9 @@
         </w:tc>
       </w:tr>
       <w:tr>
+        <w:trPr>
+          <w:jc w:val="center"/>
+        </w:trPr>
         <w:tc>
           <w:tcPr>
             <w:tcW w:w="0" w:type="auto"/>

</xml_diff>